<commit_message>
DAP QB Week 11 Ans Fix
</commit_message>
<xml_diff>
--- a/DAP - Data Analysis using Python/DAP_QB_ANS/DAP_QB_Week_11_Ans.docx
+++ b/DAP - Data Analysis using Python/DAP_QB_ANS/DAP_QB_Week_11_Ans.docx
@@ -6803,8 +6803,6 @@
                     <w:pStyle w:val="TableParagraph"/>
                     <w:rPr>
                       <w:rFonts w:asciiTheme="minorHAnsi" w:hAnsiTheme="minorHAnsi" w:cstheme="minorHAnsi"/>
-                      <w:b/>
-                      <w:bCs/>
                       <w:sz w:val="28"/>
                       <w:szCs w:val="28"/>
                       <w:lang w:val="en-IN"/>
@@ -6813,8 +6811,6 @@
                   <w:r>
                     <w:rPr>
                       <w:rFonts w:asciiTheme="minorHAnsi" w:hAnsiTheme="minorHAnsi" w:cstheme="minorHAnsi"/>
-                      <w:b/>
-                      <w:bCs/>
                       <w:sz w:val="28"/>
                       <w:szCs w:val="28"/>
                       <w:lang w:val="en-IN"/>
@@ -8994,8 +8990,6 @@
                     <w:jc w:val="center"/>
                     <w:rPr>
                       <w:rFonts w:asciiTheme="minorHAnsi" w:hAnsiTheme="minorHAnsi" w:cstheme="minorHAnsi"/>
-                      <w:b/>
-                      <w:bCs/>
                       <w:sz w:val="28"/>
                       <w:szCs w:val="28"/>
                       <w:lang w:val="en-IN"/>
@@ -9004,8 +8998,6 @@
                   <w:r>
                     <w:rPr>
                       <w:rFonts w:asciiTheme="minorHAnsi" w:hAnsiTheme="minorHAnsi" w:cstheme="minorHAnsi"/>
-                      <w:b/>
-                      <w:bCs/>
                       <w:sz w:val="28"/>
                       <w:szCs w:val="28"/>
                       <w:lang w:val="en-IN"/>
@@ -11605,7 +11597,7 @@
           <w:szCs w:val="28"/>
         </w:rPr>
         <w:sectPr>
-          <w:pgSz w:w="11913" w:h="11340"/>
+          <w:pgSz w:w="11913" w:h="9072"/>
           <w:pgMar w:top="142" w:right="573" w:bottom="0" w:left="697" w:header="720" w:footer="720" w:gutter="0"/>
           <w:cols w:space="720"/>
         </w:sectPr>
@@ -12294,7 +12286,6 @@
                 <w:szCs w:val="28"/>
                 <w:lang w:val="en-IN"/>
               </w:rPr>
-              <w:lastRenderedPageBreak/>
               <w:t>These linkage methods provide different ways to calculate the distance or dissimilarity between clusters, leading to different clustering structures and results. The choice of linkage method depends on the characteristics of the data and the specific goals of the clustering analysis.</w:t>
             </w:r>
           </w:p>
@@ -12309,7 +12300,7 @@
       </w:pPr>
     </w:p>
     <w:sectPr>
-      <w:pgSz w:w="11913" w:h="13041"/>
+      <w:pgSz w:w="11913" w:h="14742"/>
       <w:pgMar w:top="0" w:right="1480" w:bottom="0" w:left="697" w:header="720" w:footer="720" w:gutter="0"/>
       <w:cols w:space="720"/>
     </w:sectPr>
@@ -16676,6 +16667,7 @@
   <w:style w:type="character" w:default="1" w:styleId="DefaultParagraphFont">
     <w:name w:val="Default Paragraph Font"/>
     <w:uiPriority w:val="1"/>
+    <w:semiHidden/>
     <w:unhideWhenUsed/>
   </w:style>
   <w:style w:type="table" w:default="1" w:styleId="TableNormal">

</xml_diff>